<commit_message>
tbl_trec: report Cox for both predictors as computed, readable formatting; manuscript.pdf for reading (not for submission)
Co-Authored-By: Claude Opus 5.5 <noreply@anthropic.com>
</commit_message>
<xml_diff>
--- a/paper/submission/Table 9.docx
+++ b/paper/submission/Table 9.docx
@@ -10,7 +10,7 @@
         <w:t xml:space="preserve">Table 9. </w:t>
       </w:r>
       <w:r>
-        <w:t>Recovery time: Spearman (primary, BH-corrected within family), Cox and log-rank (secondary, uncorrected) for ancestor_count and hybrid_criticality. Cox hazard ratios are per unit of ancestor_count, run level with SEs clustered by service and service level; log-rank is undefined where the predictor has fewer than two distinct terciles</w:t>
+        <w:t>Recovery time: Spearman (primary, BH-corrected within family), Cox and log-rank (secondary, uncorrected) for ancestor_count and hybrid_criticality. Cox hazard ratios are per one-unit increase of the predictor, at run level with SEs clustered by service and at service level; hybrid_criticality spans less than one unit, so its hazard ratios extrapolate beyond the observed range. Log-rank is undefined where the predictor has fewer than two distinct terciles</w:t>
       </w:r>
     </w:p>
     <w:tbl>
@@ -157,7 +157,7 @@
                 <w:b/>
                 <w:sz w:val="18"/>
               </w:rPr>
-              <w:t>cox_run_hr (per ancestor)</w:t>
+              <w:t>cox_run_hr (per unit of predictor)</w:t>
             </w:r>
           </w:p>
         </w:tc>
@@ -175,7 +175,7 @@
                 <w:b/>
                 <w:sz w:val="18"/>
               </w:rPr>
-              <w:t>cox_run_ci_95 (per ancestor)</w:t>
+              <w:t>cox_run_ci_95 (per unit of predictor)</w:t>
             </w:r>
           </w:p>
         </w:tc>
@@ -211,7 +211,7 @@
                 <w:b/>
                 <w:sz w:val="18"/>
               </w:rPr>
-              <w:t>cox_service_hr (per ancestor)</w:t>
+              <w:t>cox_service_hr (per unit of predictor)</w:t>
             </w:r>
           </w:p>
         </w:tc>
@@ -229,7 +229,7 @@
                 <w:b/>
                 <w:sz w:val="18"/>
               </w:rPr>
-              <w:t>cox_service_ci_95 (per ancestor)</w:t>
+              <w:t>cox_service_ci_95 (per unit of predictor)</w:t>
             </w:r>
           </w:p>
         </w:tc>
@@ -629,6 +629,7 @@
                 <w:b w:val="0"/>
                 <w:sz w:val="18"/>
               </w:rPr>
+              <w:t>0.010</w:t>
             </w:r>
           </w:p>
         </w:tc>
@@ -646,6 +647,7 @@
                 <w:b w:val="0"/>
                 <w:sz w:val="18"/>
               </w:rPr>
+              <w:t>0.002 to 0.043</w:t>
             </w:r>
           </w:p>
         </w:tc>
@@ -663,6 +665,7 @@
                 <w:b w:val="0"/>
                 <w:sz w:val="18"/>
               </w:rPr>
+              <w:t>&lt;0.0001</w:t>
             </w:r>
           </w:p>
         </w:tc>
@@ -680,6 +683,7 @@
                 <w:b w:val="0"/>
                 <w:sz w:val="18"/>
               </w:rPr>
+              <w:t>1.408</w:t>
             </w:r>
           </w:p>
         </w:tc>
@@ -697,6 +701,7 @@
                 <w:b w:val="0"/>
                 <w:sz w:val="18"/>
               </w:rPr>
+              <w:t>5.49e-04 to 3.61e+03</w:t>
             </w:r>
           </w:p>
         </w:tc>
@@ -714,6 +719,7 @@
                 <w:b w:val="0"/>
                 <w:sz w:val="18"/>
               </w:rPr>
+              <w:t>0.9319</w:t>
             </w:r>
           </w:p>
         </w:tc>
@@ -1095,6 +1101,7 @@
                 <w:b w:val="0"/>
                 <w:sz w:val="18"/>
               </w:rPr>
+              <w:t>0.147</w:t>
             </w:r>
           </w:p>
         </w:tc>
@@ -1112,6 +1119,7 @@
                 <w:b w:val="0"/>
                 <w:sz w:val="18"/>
               </w:rPr>
+              <w:t>8.91e-04 to 24.134</w:t>
             </w:r>
           </w:p>
         </w:tc>
@@ -1129,6 +1137,7 @@
                 <w:b w:val="0"/>
                 <w:sz w:val="18"/>
               </w:rPr>
+              <w:t>0.4609</w:t>
             </w:r>
           </w:p>
         </w:tc>
@@ -1146,6 +1155,7 @@
                 <w:b w:val="0"/>
                 <w:sz w:val="18"/>
               </w:rPr>
+              <w:t>0.124</w:t>
             </w:r>
           </w:p>
         </w:tc>
@@ -1163,6 +1173,7 @@
                 <w:b w:val="0"/>
                 <w:sz w:val="18"/>
               </w:rPr>
+              <w:t>4.39e-19 to 3.50e+16</w:t>
             </w:r>
           </w:p>
         </w:tc>
@@ -1180,6 +1191,7 @@
                 <w:b w:val="0"/>
                 <w:sz w:val="18"/>
               </w:rPr>
+              <w:t>0.9189</w:t>
             </w:r>
           </w:p>
         </w:tc>
@@ -1561,6 +1573,7 @@
                 <w:b w:val="0"/>
                 <w:sz w:val="18"/>
               </w:rPr>
+              <w:t>0.045</w:t>
             </w:r>
           </w:p>
         </w:tc>
@@ -1578,6 +1591,7 @@
                 <w:b w:val="0"/>
                 <w:sz w:val="18"/>
               </w:rPr>
+              <w:t>0.002 to 1.163</w:t>
             </w:r>
           </w:p>
         </w:tc>
@@ -1595,6 +1609,7 @@
                 <w:b w:val="0"/>
                 <w:sz w:val="18"/>
               </w:rPr>
+              <w:t>0.0616</w:t>
             </w:r>
           </w:p>
         </w:tc>
@@ -1612,6 +1627,7 @@
                 <w:b w:val="0"/>
                 <w:sz w:val="18"/>
               </w:rPr>
+              <w:t>2.49e-04</w:t>
             </w:r>
           </w:p>
         </w:tc>
@@ -1629,6 +1645,7 @@
                 <w:b w:val="0"/>
                 <w:sz w:val="18"/>
               </w:rPr>
+              <w:t>8.19e-10 to 75.493</w:t>
             </w:r>
           </w:p>
         </w:tc>
@@ -1646,6 +1663,7 @@
                 <w:b w:val="0"/>
                 <w:sz w:val="18"/>
               </w:rPr>
+              <w:t>0.1975</w:t>
             </w:r>
           </w:p>
         </w:tc>
@@ -2027,6 +2045,7 @@
                 <w:b w:val="0"/>
                 <w:sz w:val="18"/>
               </w:rPr>
+              <w:t>6.26e-04</w:t>
             </w:r>
           </w:p>
         </w:tc>
@@ -2044,6 +2063,7 @@
                 <w:b w:val="0"/>
                 <w:sz w:val="18"/>
               </w:rPr>
+              <w:t>1.07e-06 to 0.368</w:t>
             </w:r>
           </w:p>
         </w:tc>
@@ -2061,6 +2081,7 @@
                 <w:b w:val="0"/>
                 <w:sz w:val="18"/>
               </w:rPr>
+              <w:t>0.0234</w:t>
             </w:r>
           </w:p>
         </w:tc>
@@ -2078,6 +2099,7 @@
                 <w:b w:val="0"/>
                 <w:sz w:val="18"/>
               </w:rPr>
+              <w:t>1.02e-05</w:t>
             </w:r>
           </w:p>
         </w:tc>
@@ -2095,6 +2117,7 @@
                 <w:b w:val="0"/>
                 <w:sz w:val="18"/>
               </w:rPr>
+              <w:t>4.03e-23 to 2.57e+12</w:t>
             </w:r>
           </w:p>
         </w:tc>
@@ -2112,6 +2135,7 @@
                 <w:b w:val="0"/>
                 <w:sz w:val="18"/>
               </w:rPr>
+              <w:t>0.5740</w:t>
             </w:r>
           </w:p>
         </w:tc>

</xml_diff>

<commit_message>
tbl_trec: not-estimable rule for Cox fits, raw estimates as supplementary file; Locust version from data/environment/tool_versions.txt
Cox fits with a failed estimate or CI upper bound > 1e6 show 'not estimable' with a footnote;
two cells changed (Hotel Reservation, hybrid_criticality, service level, kill and latency).
tbl_trec_supplementary keeps every raw value and is copied to submission/. The Locust line is
extracted from _audit/ENVIRONMENT_STATUS.md, which holds local paths and stays private.

Co-Authored-By: Claude Opus 5.5 <noreply@anthropic.com>
</commit_message>
<xml_diff>
--- a/paper/submission/Table 9.docx
+++ b/paper/submission/Table 9.docx
@@ -1155,7 +1155,7 @@
                 <w:b w:val="0"/>
                 <w:sz w:val="18"/>
               </w:rPr>
-              <w:t>0.124</w:t>
+              <w:t>not estimable</w:t>
             </w:r>
           </w:p>
         </w:tc>
@@ -1173,7 +1173,7 @@
                 <w:b w:val="0"/>
                 <w:sz w:val="18"/>
               </w:rPr>
-              <w:t>4.39e-19 to 3.50e+16</w:t>
+              <w:t>not estimable</w:t>
             </w:r>
           </w:p>
         </w:tc>
@@ -1191,7 +1191,7 @@
                 <w:b w:val="0"/>
                 <w:sz w:val="18"/>
               </w:rPr>
-              <w:t>0.9189</w:t>
+              <w:t>not estimable</w:t>
             </w:r>
           </w:p>
         </w:tc>
@@ -2099,7 +2099,7 @@
                 <w:b w:val="0"/>
                 <w:sz w:val="18"/>
               </w:rPr>
-              <w:t>1.02e-05</w:t>
+              <w:t>not estimable</w:t>
             </w:r>
           </w:p>
         </w:tc>
@@ -2117,7 +2117,7 @@
                 <w:b w:val="0"/>
                 <w:sz w:val="18"/>
               </w:rPr>
-              <w:t>4.03e-23 to 2.57e+12</w:t>
+              <w:t>not estimable</w:t>
             </w:r>
           </w:p>
         </w:tc>
@@ -2135,7 +2135,7 @@
                 <w:b w:val="0"/>
                 <w:sz w:val="18"/>
               </w:rPr>
-              <w:t>0.5740</w:t>
+              <w:t>not estimable</w:t>
             </w:r>
           </w:p>
         </w:tc>
@@ -2162,6 +2162,11 @@
     <w:p>
       <w:r>
         <w:t>Units are given in parentheses in the column headers; columns without a unit are dimensionless or categorical.</w:t>
+      </w:r>
+    </w:p>
+    <w:p>
+      <w:r>
+        <w:t>Not estimable: the Cox fit did not converge or showed separation because the predictor takes few distinct values; raw estimates are in the supplementary file.</w:t>
       </w:r>
     </w:p>
     <w:sectPr>

</xml_diff>